<commit_message>
Rebuild paper references and citations
</commit_message>
<xml_diff>
--- a/final/韩观萍小论文_参考文献重构版.docx
+++ b/final/韩观萍小论文_参考文献重构版.docx
@@ -800,41 +800,6 @@
           <w:szCs w:val="21"/>
         </w:rPr>
         <w:t>余年历史遗存[12]。</w:t>
-      </w:r>
-      <w:r>
-        <w:rPr>
-          <w:rFonts w:hint="eastAsia" w:ascii="Times New Roman" w:hAnsi="Times New Roman" w:eastAsia="宋体"/>
-          <w:szCs w:val="21"/>
-          <w:vertAlign w:val="superscript"/>
-        </w:rPr>
-        <w:fldChar w:fldCharType="begin"/>
-      </w:r>
-      <w:r>
-        <w:instrText xml:space="preserve"> REF _Ref21614 \r \h  \* MERGEFORMAT</w:instrText>
-      </w:r>
-      <w:r>
-        <w:rPr>
-          <w:rFonts w:hint="eastAsia" w:ascii="Times New Roman" w:hAnsi="Times New Roman" w:eastAsia="宋体"/>
-          <w:szCs w:val="21"/>
-          <w:vertAlign w:val="superscript"/>
-        </w:rPr>
-        <w:fldChar w:fldCharType="separate"/>
-      </w:r>
-      <w:r>
-        <w:rPr>
-          <w:rFonts w:hint="eastAsia" w:ascii="Times New Roman" w:hAnsi="Times New Roman" w:eastAsia="宋体"/>
-          <w:szCs w:val="21"/>
-          <w:vertAlign w:val="superscript"/>
-        </w:rPr>
-        <w:t/>
-      </w:r>
-      <w:r>
-        <w:rPr>
-          <w:rFonts w:hint="eastAsia" w:ascii="Times New Roman" w:hAnsi="Times New Roman" w:eastAsia="宋体"/>
-          <w:szCs w:val="21"/>
-          <w:vertAlign w:val="superscript"/>
-        </w:rPr>
-        <w:fldChar w:fldCharType="end"/>
       </w:r>
       <w:r>
         <w:rPr>

</xml_diff>